<commit_message>
[Claude Code] 需要 prompt #54
</commit_message>
<xml_diff>
--- a/thesis.docx
+++ b/thesis.docx
@@ -1591,7 +1591,7 @@
     </w:p>
     <w:bookmarkEnd w:id="26"/>
     <w:bookmarkEnd w:id="27"/>
-    <w:bookmarkStart w:id="39" w:name="系统设计"/>
+    <w:bookmarkStart w:id="42" w:name="系统设计"/>
     <w:p>
       <w:pPr>
         <w:pStyle w:val="Heading1"/>
@@ -1603,7 +1603,7 @@
         <w:t xml:space="preserve">系统设计</w:t>
       </w:r>
     </w:p>
-    <w:bookmarkStart w:id="28" w:name="总体架构设计"/>
+    <w:bookmarkStart w:id="31" w:name="总体架构设计"/>
     <w:p>
       <w:pPr>
         <w:pStyle w:val="Heading2"/>
@@ -1845,399 +1845,6 @@
         <w:t xml:space="preserve">（强制登录校验）。三层拦截器的设计使得系统能够优雅地处理游客、普通登录用户与管理员的不同访问权限，无需在每个Controller中重复鉴权逻辑。</w:t>
       </w:r>
     </w:p>
-    <w:bookmarkEnd w:id="28"/>
-    <w:bookmarkStart w:id="32" w:name="数据库设计"/>
-    <w:p>
-      <w:pPr>
-        <w:pStyle w:val="Heading2"/>
-      </w:pPr>
-      <w:r>
-        <w:rPr>
-          <w:rFonts w:hint="eastAsia"/>
-        </w:rPr>
-        <w:t xml:space="preserve">数据库设计</w:t>
-      </w:r>
-    </w:p>
-    <w:p>
-      <w:pPr>
-        <w:pStyle w:val="FirstParagraph"/>
-      </w:pPr>
-      <w:r>
-        <w:rPr>
-          <w:rFonts w:hint="eastAsia"/>
-        </w:rPr>
-        <w:t xml:space="preserve">系统数据库包含17张核心业务表，设计遵循第三范式，通过外键逻辑关联（代码层维护，不使用数据库外键约束以保证性能）。以下介绍主要核心表的设计。</w:t>
-      </w:r>
-    </w:p>
-    <w:p>
-      <w:pPr>
-        <w:pStyle w:val="BodyText"/>
-      </w:pPr>
-      <w:r>
-        <w:rPr>
-          <w:rFonts w:hint="eastAsia"/>
-          <w:b/>
-          <w:bCs/>
-        </w:rPr>
-        <w:t xml:space="preserve">users表</w:t>
-      </w:r>
-      <w:r>
-        <w:rPr>
-          <w:rFonts w:hint="eastAsia"/>
-        </w:rPr>
-        <w:t xml:space="preserve">：系统用户基础信息表，主键</w:t>
-      </w:r>
-      <w:r>
-        <w:rPr>
-          <w:rStyle w:val="VerbatimChar"/>
-        </w:rPr>
-        <w:t xml:space="preserve">uid</w:t>
-      </w:r>
-      <w:r>
-        <w:rPr>
-          <w:rFonts w:hint="eastAsia"/>
-        </w:rPr>
-        <w:t xml:space="preserve">（bigint，自增），核心字段包括</w:t>
-      </w:r>
-      <w:r>
-        <w:rPr>
-          <w:rStyle w:val="VerbatimChar"/>
-        </w:rPr>
-        <w:t xml:space="preserve">username</w:t>
-      </w:r>
-      <w:r>
-        <w:rPr>
-          <w:rFonts w:hint="eastAsia"/>
-        </w:rPr>
-        <w:t xml:space="preserve">（唯一登录名）、</w:t>
-      </w:r>
-      <w:r>
-        <w:rPr>
-          <w:rStyle w:val="VerbatimChar"/>
-        </w:rPr>
-        <w:t xml:space="preserve">password_hash</w:t>
-      </w:r>
-      <w:r>
-        <w:rPr>
-          <w:rFonts w:hint="eastAsia"/>
-        </w:rPr>
-        <w:t xml:space="preserve">（MD5哈希）、</w:t>
-      </w:r>
-      <w:r>
-        <w:rPr>
-          <w:rStyle w:val="VerbatimChar"/>
-        </w:rPr>
-        <w:t xml:space="preserve">nickname</w:t>
-      </w:r>
-      <w:r>
-        <w:t xml:space="preserve">、</w:t>
-      </w:r>
-      <w:r>
-        <w:rPr>
-          <w:rStyle w:val="VerbatimChar"/>
-        </w:rPr>
-        <w:t xml:space="preserve">email</w:t>
-      </w:r>
-      <w:r>
-        <w:t xml:space="preserve">、</w:t>
-      </w:r>
-      <w:r>
-        <w:rPr>
-          <w:rStyle w:val="VerbatimChar"/>
-        </w:rPr>
-        <w:t xml:space="preserve">role</w:t>
-      </w:r>
-      <w:r>
-        <w:rPr>
-          <w:rFonts w:hint="eastAsia"/>
-        </w:rPr>
-        <w:t xml:space="preserve">（student/teacher/admin）、</w:t>
-      </w:r>
-      <w:r>
-        <w:rPr>
-          <w:rStyle w:val="VerbatimChar"/>
-        </w:rPr>
-        <w:t xml:space="preserve">status</w:t>
-      </w:r>
-      <w:r>
-        <w:rPr>
-          <w:rFonts w:hint="eastAsia"/>
-        </w:rPr>
-        <w:t xml:space="preserve">（0禁用/1正常）、</w:t>
-      </w:r>
-      <w:r>
-        <w:rPr>
-          <w:rStyle w:val="VerbatimChar"/>
-        </w:rPr>
-        <w:t xml:space="preserve">points</w:t>
-      </w:r>
-      <w:r>
-        <w:rPr>
-          <w:rFonts w:hint="eastAsia"/>
-        </w:rPr>
-        <w:t xml:space="preserve">（积分）、</w:t>
-      </w:r>
-      <w:r>
-        <w:rPr>
-          <w:rStyle w:val="VerbatimChar"/>
-        </w:rPr>
-        <w:t xml:space="preserve">level</w:t>
-      </w:r>
-      <w:r>
-        <w:rPr>
-          <w:rFonts w:hint="eastAsia"/>
-        </w:rPr>
-        <w:t xml:space="preserve">（1-10级）、</w:t>
-      </w:r>
-      <w:r>
-        <w:rPr>
-          <w:rStyle w:val="VerbatimChar"/>
-        </w:rPr>
-        <w:t xml:space="preserve">credit_score</w:t>
-      </w:r>
-      <w:r>
-        <w:rPr>
-          <w:rFonts w:hint="eastAsia"/>
-        </w:rPr>
-        <w:t xml:space="preserve">（信用分）。表设有</w:t>
-      </w:r>
-      <w:r>
-        <w:rPr>
-          <w:rStyle w:val="VerbatimChar"/>
-        </w:rPr>
-        <w:t xml:space="preserve">created_at</w:t>
-      </w:r>
-      <w:r>
-        <w:rPr>
-          <w:rFonts w:hint="eastAsia"/>
-        </w:rPr>
-        <w:t xml:space="preserve">与</w:t>
-      </w:r>
-      <w:r>
-        <w:rPr>
-          <w:rStyle w:val="VerbatimChar"/>
-        </w:rPr>
-        <w:t xml:space="preserve">updated_at</w:t>
-      </w:r>
-      <w:r>
-        <w:rPr>
-          <w:rFonts w:hint="eastAsia"/>
-        </w:rPr>
-        <w:t xml:space="preserve">字段，由MyBatisMetaObjectHandler自动填充。</w:t>
-      </w:r>
-    </w:p>
-    <w:p>
-      <w:pPr>
-        <w:pStyle w:val="BodyText"/>
-      </w:pPr>
-      <w:r>
-        <w:rPr>
-          <w:rFonts w:hint="eastAsia"/>
-          <w:b/>
-          <w:bCs/>
-        </w:rPr>
-        <w:t xml:space="preserve">resources表</w:t>
-      </w:r>
-      <w:r>
-        <w:rPr>
-          <w:rFonts w:hint="eastAsia"/>
-        </w:rPr>
-        <w:t xml:space="preserve">：学习资源表，记录文件标题、描述、类型、存储URL、上传者、文件大小、下载次数、审核状态（0待审/1通过/2拒绝）及拒绝原因。</w:t>
-      </w:r>
-    </w:p>
-    <w:p>
-      <w:pPr>
-        <w:pStyle w:val="BodyText"/>
-      </w:pPr>
-      <w:r>
-        <w:rPr>
-          <w:rFonts w:hint="eastAsia"/>
-          <w:b/>
-          <w:bCs/>
-        </w:rPr>
-        <w:t xml:space="preserve">questions表</w:t>
-      </w:r>
-      <w:r>
-        <w:rPr>
-          <w:rFonts w:hint="eastAsia"/>
-        </w:rPr>
-        <w:t xml:space="preserve">：问题表，包含标题、Markdown内容、提问者、标签（JSON数组）、悬赏积分、浏览数、回答数及状态（0隐藏/1正常）。</w:t>
-      </w:r>
-    </w:p>
-    <w:p>
-      <w:pPr>
-        <w:pStyle w:val="BodyText"/>
-      </w:pPr>
-      <w:r>
-        <w:rPr>
-          <w:rFonts w:hint="eastAsia"/>
-          <w:b/>
-          <w:bCs/>
-        </w:rPr>
-        <w:t xml:space="preserve">answers表</w:t>
-      </w:r>
-      <w:r>
-        <w:rPr>
-          <w:rFonts w:hint="eastAsia"/>
-        </w:rPr>
-        <w:t xml:space="preserve">：回答表，关联问题ID与回答者，存储Markdown内容、点赞数、是否被采纳（</w:t>
-      </w:r>
-      <w:r>
-        <w:rPr>
-          <w:rStyle w:val="VerbatimChar"/>
-        </w:rPr>
-        <w:t xml:space="preserve">is_adopted</w:t>
-      </w:r>
-      <w:r>
-        <w:rPr>
-          <w:rFonts w:hint="eastAsia"/>
-        </w:rPr>
-        <w:t xml:space="preserve">）。</w:t>
-      </w:r>
-    </w:p>
-    <w:p>
-      <w:pPr>
-        <w:pStyle w:val="BodyText"/>
-      </w:pPr>
-      <w:r>
-        <w:rPr>
-          <w:rFonts w:hint="eastAsia"/>
-          <w:b/>
-          <w:bCs/>
-        </w:rPr>
-        <w:t xml:space="preserve">tasks表</w:t>
-      </w:r>
-      <w:r>
-        <w:rPr>
-          <w:rFonts w:hint="eastAsia"/>
-        </w:rPr>
-        <w:t xml:space="preserve">：任务表，状态字段采用枚举类型（0待接单/1已废弃/2进行中/3待确认/4已完成/5已取消/6已超时），记录发布者、接单者、悬赏积分、截止时间等信息。</w:t>
-      </w:r>
-    </w:p>
-    <w:p>
-      <w:pPr>
-        <w:pStyle w:val="BodyText"/>
-      </w:pPr>
-      <w:r>
-        <w:rPr>
-          <w:rFonts w:hint="eastAsia"/>
-          <w:b/>
-          <w:bCs/>
-        </w:rPr>
-        <w:t xml:space="preserve">clubs表与activities表</w:t>
-      </w:r>
-      <w:r>
-        <w:rPr>
-          <w:rFonts w:hint="eastAsia"/>
-        </w:rPr>
-        <w:t xml:space="preserve">：社团与活动的主体信息，活动状态流转为0未开始→1进行中→2已结束，可强制转为3已取消。</w:t>
-      </w:r>
-    </w:p>
-    <w:p>
-      <w:pPr>
-        <w:pStyle w:val="BodyText"/>
-      </w:pPr>
-      <w:r>
-        <w:rPr>
-          <w:rFonts w:hint="eastAsia"/>
-          <w:b/>
-          <w:bCs/>
-        </w:rPr>
-        <w:t xml:space="preserve">notifications表</w:t>
-      </w:r>
-      <w:r>
-        <w:rPr>
-          <w:rFonts w:hint="eastAsia"/>
-        </w:rPr>
-        <w:t xml:space="preserve">：通知中心，通过</w:t>
-      </w:r>
-      <w:r>
-        <w:rPr>
-          <w:rStyle w:val="VerbatimChar"/>
-        </w:rPr>
-        <w:t xml:space="preserve">notify_type</w:t>
-      </w:r>
-      <w:r>
-        <w:rPr>
-          <w:rFonts w:hint="eastAsia"/>
-        </w:rPr>
-        <w:t xml:space="preserve">字段区分通知类型（system/answer/task/activity/message），关联发起实体的ID，支持已读/未读状态管理。</w:t>
-      </w:r>
-    </w:p>
-    <w:p>
-      <w:pPr>
-        <w:pStyle w:val="BodyText"/>
-      </w:pPr>
-      <w:r>
-        <w:rPr>
-          <w:rFonts w:hint="eastAsia"/>
-          <w:b/>
-          <w:bCs/>
-        </w:rPr>
-        <w:t xml:space="preserve">points_history表</w:t>
-      </w:r>
-      <w:r>
-        <w:rPr>
-          <w:rFonts w:hint="eastAsia"/>
-        </w:rPr>
-        <w:t xml:space="preserve">：积分流水表，完整记录每次积分变动的来源类型（</w:t>
-      </w:r>
-      <w:r>
-        <w:rPr>
-          <w:rStyle w:val="VerbatimChar"/>
-        </w:rPr>
-        <w:t xml:space="preserve">related_type</w:t>
-      </w:r>
-      <w:r>
-        <w:rPr>
-          <w:rFonts w:hint="eastAsia"/>
-        </w:rPr>
-        <w:t xml:space="preserve">）、变动量（</w:t>
-      </w:r>
-      <w:r>
-        <w:rPr>
-          <w:rStyle w:val="VerbatimChar"/>
-        </w:rPr>
-        <w:t xml:space="preserve">points_change</w:t>
-      </w:r>
-      <w:r>
-        <w:rPr>
-          <w:rFonts w:hint="eastAsia"/>
-        </w:rPr>
-        <w:t xml:space="preserve">）及变动后余额（</w:t>
-      </w:r>
-      <w:r>
-        <w:rPr>
-          <w:rStyle w:val="VerbatimChar"/>
-        </w:rPr>
-        <w:t xml:space="preserve">points_after</w:t>
-      </w:r>
-      <w:r>
-        <w:rPr>
-          <w:rFonts w:hint="eastAsia"/>
-        </w:rPr>
-        <w:t xml:space="preserve">），为用户提供完整的积分明细查询。</w:t>
-      </w:r>
-    </w:p>
-    <w:p>
-      <w:pPr>
-        <w:pStyle w:val="BodyText"/>
-      </w:pPr>
-      <w:r>
-        <w:rPr>
-          <w:rFonts w:hint="eastAsia"/>
-          <w:b/>
-          <w:bCs/>
-        </w:rPr>
-        <w:t xml:space="preserve">system_config表</w:t>
-      </w:r>
-      <w:r>
-        <w:rPr>
-          <w:rFonts w:hint="eastAsia"/>
-        </w:rPr>
-        <w:t xml:space="preserve">：系统配置表，采用Key-Value结构存储29项可配置参数，包括积分规则、等级阈值、上传限制、功能开关等，支持在线修改无需重启。</w:t>
-      </w:r>
-    </w:p>
     <w:p>
       <w:pPr>
         <w:pStyle w:val="CaptionedFigure"/>
@@ -2245,20 +1852,502 @@
       <w:r>
         <w:drawing>
           <wp:inline>
-            <wp:extent cx="5334000" cy="3886200"/>
+            <wp:extent cx="5334000" cy="2991937"/>
             <wp:effectExtent b="0" l="0" r="0" t="0"/>
-            <wp:docPr descr="图4-1 数据库核心ER图" title="" id="30" name="Picture"/>
+            <wp:docPr descr="图4-1 CampusLink系统总体架构图" title="" id="29" name="Picture"/>
             <a:graphic>
               <a:graphicData uri="http://schemas.openxmlformats.org/drawingml/2006/picture">
                 <pic:pic>
                   <pic:nvPicPr>
-                    <pic:cNvPr descr="thesis-figures/02_er_diagram.png" id="31" name="Picture"/>
+                    <pic:cNvPr descr="thesis-figures/09_architecture.png" id="30" name="Picture"/>
                     <pic:cNvPicPr>
                       <a:picLocks noChangeArrowheads="1" noChangeAspect="1"/>
                     </pic:cNvPicPr>
                   </pic:nvPicPr>
                   <pic:blipFill>
-                    <a:blip r:embed="rId29"/>
+                    <a:blip r:embed="rId28"/>
+                    <a:stretch>
+                      <a:fillRect/>
+                    </a:stretch>
+                  </pic:blipFill>
+                  <pic:spPr bwMode="auto">
+                    <a:xfrm>
+                      <a:off x="0" y="0"/>
+                      <a:ext cx="5334000" cy="2991937"/>
+                    </a:xfrm>
+                    <a:prstGeom prst="rect">
+                      <a:avLst/>
+                    </a:prstGeom>
+                    <a:noFill/>
+                    <a:ln w="9525">
+                      <a:noFill/>
+                      <a:headEnd/>
+                      <a:tailEnd/>
+                    </a:ln>
+                  </pic:spPr>
+                </pic:pic>
+              </a:graphicData>
+            </a:graphic>
+          </wp:inline>
+        </w:drawing>
+      </w:r>
+    </w:p>
+    <w:p>
+      <w:pPr>
+        <w:pStyle w:val="ImageCaption"/>
+      </w:pPr>
+      <w:r>
+        <w:rPr>
+          <w:rFonts w:hint="eastAsia"/>
+        </w:rPr>
+        <w:t xml:space="preserve">图4-1</w:t>
+      </w:r>
+      <w:r>
+        <w:t xml:space="preserve"> </w:t>
+      </w:r>
+      <w:r>
+        <w:rPr>
+          <w:rFonts w:hint="eastAsia"/>
+        </w:rPr>
+        <w:t xml:space="preserve">CampusLink系统总体架构图</w:t>
+      </w:r>
+    </w:p>
+    <w:p>
+      <w:pPr>
+        <w:pStyle w:val="BodyText"/>
+      </w:pPr>
+      <w:r>
+        <w:rPr>
+          <w:rFonts w:hint="eastAsia"/>
+          <w:b/>
+          <w:bCs/>
+        </w:rPr>
+        <w:t xml:space="preserve">图4-1</w:t>
+      </w:r>
+      <w:r>
+        <w:t xml:space="preserve"> </w:t>
+      </w:r>
+      <w:r>
+        <w:rPr>
+          <w:rFonts w:hint="eastAsia"/>
+        </w:rPr>
+        <w:t xml:space="preserve">CampusLink系统总体架构图</w:t>
+      </w:r>
+    </w:p>
+    <w:bookmarkEnd w:id="31"/>
+    <w:bookmarkStart w:id="35" w:name="数据库设计"/>
+    <w:p>
+      <w:pPr>
+        <w:pStyle w:val="Heading2"/>
+      </w:pPr>
+      <w:r>
+        <w:rPr>
+          <w:rFonts w:hint="eastAsia"/>
+        </w:rPr>
+        <w:t xml:space="preserve">数据库设计</w:t>
+      </w:r>
+    </w:p>
+    <w:p>
+      <w:pPr>
+        <w:pStyle w:val="FirstParagraph"/>
+      </w:pPr>
+      <w:r>
+        <w:rPr>
+          <w:rFonts w:hint="eastAsia"/>
+        </w:rPr>
+        <w:t xml:space="preserve">系统数据库包含17张核心业务表，设计遵循第三范式，通过外键逻辑关联（代码层维护，不使用数据库外键约束以保证性能）。以下介绍主要核心表的设计。</w:t>
+      </w:r>
+    </w:p>
+    <w:p>
+      <w:pPr>
+        <w:pStyle w:val="BodyText"/>
+      </w:pPr>
+      <w:r>
+        <w:rPr>
+          <w:rFonts w:hint="eastAsia"/>
+          <w:b/>
+          <w:bCs/>
+        </w:rPr>
+        <w:t xml:space="preserve">users表</w:t>
+      </w:r>
+      <w:r>
+        <w:rPr>
+          <w:rFonts w:hint="eastAsia"/>
+        </w:rPr>
+        <w:t xml:space="preserve">：系统用户基础信息表，主键</w:t>
+      </w:r>
+      <w:r>
+        <w:rPr>
+          <w:rStyle w:val="VerbatimChar"/>
+        </w:rPr>
+        <w:t xml:space="preserve">uid</w:t>
+      </w:r>
+      <w:r>
+        <w:rPr>
+          <w:rFonts w:hint="eastAsia"/>
+        </w:rPr>
+        <w:t xml:space="preserve">（bigint，自增），核心字段包括</w:t>
+      </w:r>
+      <w:r>
+        <w:rPr>
+          <w:rStyle w:val="VerbatimChar"/>
+        </w:rPr>
+        <w:t xml:space="preserve">username</w:t>
+      </w:r>
+      <w:r>
+        <w:rPr>
+          <w:rFonts w:hint="eastAsia"/>
+        </w:rPr>
+        <w:t xml:space="preserve">（唯一登录名）、</w:t>
+      </w:r>
+      <w:r>
+        <w:rPr>
+          <w:rStyle w:val="VerbatimChar"/>
+        </w:rPr>
+        <w:t xml:space="preserve">password_hash</w:t>
+      </w:r>
+      <w:r>
+        <w:rPr>
+          <w:rFonts w:hint="eastAsia"/>
+        </w:rPr>
+        <w:t xml:space="preserve">（MD5哈希）、</w:t>
+      </w:r>
+      <w:r>
+        <w:rPr>
+          <w:rStyle w:val="VerbatimChar"/>
+        </w:rPr>
+        <w:t xml:space="preserve">nickname</w:t>
+      </w:r>
+      <w:r>
+        <w:t xml:space="preserve">、</w:t>
+      </w:r>
+      <w:r>
+        <w:rPr>
+          <w:rStyle w:val="VerbatimChar"/>
+        </w:rPr>
+        <w:t xml:space="preserve">email</w:t>
+      </w:r>
+      <w:r>
+        <w:t xml:space="preserve">、</w:t>
+      </w:r>
+      <w:r>
+        <w:rPr>
+          <w:rStyle w:val="VerbatimChar"/>
+        </w:rPr>
+        <w:t xml:space="preserve">role</w:t>
+      </w:r>
+      <w:r>
+        <w:rPr>
+          <w:rFonts w:hint="eastAsia"/>
+        </w:rPr>
+        <w:t xml:space="preserve">（student/teacher/admin）、</w:t>
+      </w:r>
+      <w:r>
+        <w:rPr>
+          <w:rStyle w:val="VerbatimChar"/>
+        </w:rPr>
+        <w:t xml:space="preserve">status</w:t>
+      </w:r>
+      <w:r>
+        <w:rPr>
+          <w:rFonts w:hint="eastAsia"/>
+        </w:rPr>
+        <w:t xml:space="preserve">（0禁用/1正常）、</w:t>
+      </w:r>
+      <w:r>
+        <w:rPr>
+          <w:rStyle w:val="VerbatimChar"/>
+        </w:rPr>
+        <w:t xml:space="preserve">points</w:t>
+      </w:r>
+      <w:r>
+        <w:rPr>
+          <w:rFonts w:hint="eastAsia"/>
+        </w:rPr>
+        <w:t xml:space="preserve">（积分）、</w:t>
+      </w:r>
+      <w:r>
+        <w:rPr>
+          <w:rStyle w:val="VerbatimChar"/>
+        </w:rPr>
+        <w:t xml:space="preserve">level</w:t>
+      </w:r>
+      <w:r>
+        <w:rPr>
+          <w:rFonts w:hint="eastAsia"/>
+        </w:rPr>
+        <w:t xml:space="preserve">（1-10级）、</w:t>
+      </w:r>
+      <w:r>
+        <w:rPr>
+          <w:rStyle w:val="VerbatimChar"/>
+        </w:rPr>
+        <w:t xml:space="preserve">credit_score</w:t>
+      </w:r>
+      <w:r>
+        <w:rPr>
+          <w:rFonts w:hint="eastAsia"/>
+        </w:rPr>
+        <w:t xml:space="preserve">（信用分）。表设有</w:t>
+      </w:r>
+      <w:r>
+        <w:rPr>
+          <w:rStyle w:val="VerbatimChar"/>
+        </w:rPr>
+        <w:t xml:space="preserve">created_at</w:t>
+      </w:r>
+      <w:r>
+        <w:rPr>
+          <w:rFonts w:hint="eastAsia"/>
+        </w:rPr>
+        <w:t xml:space="preserve">与</w:t>
+      </w:r>
+      <w:r>
+        <w:rPr>
+          <w:rStyle w:val="VerbatimChar"/>
+        </w:rPr>
+        <w:t xml:space="preserve">updated_at</w:t>
+      </w:r>
+      <w:r>
+        <w:rPr>
+          <w:rFonts w:hint="eastAsia"/>
+        </w:rPr>
+        <w:t xml:space="preserve">字段，由MyBatisMetaObjectHandler自动填充。</w:t>
+      </w:r>
+    </w:p>
+    <w:p>
+      <w:pPr>
+        <w:pStyle w:val="BodyText"/>
+      </w:pPr>
+      <w:r>
+        <w:rPr>
+          <w:rFonts w:hint="eastAsia"/>
+          <w:b/>
+          <w:bCs/>
+        </w:rPr>
+        <w:t xml:space="preserve">resources表</w:t>
+      </w:r>
+      <w:r>
+        <w:rPr>
+          <w:rFonts w:hint="eastAsia"/>
+        </w:rPr>
+        <w:t xml:space="preserve">：学习资源表，记录文件标题、描述、类型、存储URL、上传者、文件大小、下载次数、审核状态（0待审/1通过/2拒绝）及拒绝原因。</w:t>
+      </w:r>
+    </w:p>
+    <w:p>
+      <w:pPr>
+        <w:pStyle w:val="BodyText"/>
+      </w:pPr>
+      <w:r>
+        <w:rPr>
+          <w:rFonts w:hint="eastAsia"/>
+          <w:b/>
+          <w:bCs/>
+        </w:rPr>
+        <w:t xml:space="preserve">questions表</w:t>
+      </w:r>
+      <w:r>
+        <w:rPr>
+          <w:rFonts w:hint="eastAsia"/>
+        </w:rPr>
+        <w:t xml:space="preserve">：问题表，包含标题、Markdown内容、提问者、标签（JSON数组）、悬赏积分、浏览数、回答数及状态（0隐藏/1正常）。</w:t>
+      </w:r>
+    </w:p>
+    <w:p>
+      <w:pPr>
+        <w:pStyle w:val="BodyText"/>
+      </w:pPr>
+      <w:r>
+        <w:rPr>
+          <w:rFonts w:hint="eastAsia"/>
+          <w:b/>
+          <w:bCs/>
+        </w:rPr>
+        <w:t xml:space="preserve">answers表</w:t>
+      </w:r>
+      <w:r>
+        <w:rPr>
+          <w:rFonts w:hint="eastAsia"/>
+        </w:rPr>
+        <w:t xml:space="preserve">：回答表，关联问题ID与回答者，存储Markdown内容、点赞数、是否被采纳（</w:t>
+      </w:r>
+      <w:r>
+        <w:rPr>
+          <w:rStyle w:val="VerbatimChar"/>
+        </w:rPr>
+        <w:t xml:space="preserve">is_adopted</w:t>
+      </w:r>
+      <w:r>
+        <w:rPr>
+          <w:rFonts w:hint="eastAsia"/>
+        </w:rPr>
+        <w:t xml:space="preserve">）。</w:t>
+      </w:r>
+    </w:p>
+    <w:p>
+      <w:pPr>
+        <w:pStyle w:val="BodyText"/>
+      </w:pPr>
+      <w:r>
+        <w:rPr>
+          <w:rFonts w:hint="eastAsia"/>
+          <w:b/>
+          <w:bCs/>
+        </w:rPr>
+        <w:t xml:space="preserve">tasks表</w:t>
+      </w:r>
+      <w:r>
+        <w:rPr>
+          <w:rFonts w:hint="eastAsia"/>
+        </w:rPr>
+        <w:t xml:space="preserve">：任务表，状态字段采用枚举类型（0待接单/1已废弃/2进行中/3待确认/4已完成/5已取消/6已超时），记录发布者、接单者、悬赏积分、截止时间等信息。</w:t>
+      </w:r>
+    </w:p>
+    <w:p>
+      <w:pPr>
+        <w:pStyle w:val="BodyText"/>
+      </w:pPr>
+      <w:r>
+        <w:rPr>
+          <w:rFonts w:hint="eastAsia"/>
+          <w:b/>
+          <w:bCs/>
+        </w:rPr>
+        <w:t xml:space="preserve">clubs表与activities表</w:t>
+      </w:r>
+      <w:r>
+        <w:rPr>
+          <w:rFonts w:hint="eastAsia"/>
+        </w:rPr>
+        <w:t xml:space="preserve">：社团与活动的主体信息，活动状态流转为0未开始→1进行中→2已结束，可强制转为3已取消。</w:t>
+      </w:r>
+    </w:p>
+    <w:p>
+      <w:pPr>
+        <w:pStyle w:val="BodyText"/>
+      </w:pPr>
+      <w:r>
+        <w:rPr>
+          <w:rFonts w:hint="eastAsia"/>
+          <w:b/>
+          <w:bCs/>
+        </w:rPr>
+        <w:t xml:space="preserve">notifications表</w:t>
+      </w:r>
+      <w:r>
+        <w:rPr>
+          <w:rFonts w:hint="eastAsia"/>
+        </w:rPr>
+        <w:t xml:space="preserve">：通知中心，通过</w:t>
+      </w:r>
+      <w:r>
+        <w:rPr>
+          <w:rStyle w:val="VerbatimChar"/>
+        </w:rPr>
+        <w:t xml:space="preserve">notify_type</w:t>
+      </w:r>
+      <w:r>
+        <w:rPr>
+          <w:rFonts w:hint="eastAsia"/>
+        </w:rPr>
+        <w:t xml:space="preserve">字段区分通知类型（system/answer/task/activity/message），关联发起实体的ID，支持已读/未读状态管理。</w:t>
+      </w:r>
+    </w:p>
+    <w:p>
+      <w:pPr>
+        <w:pStyle w:val="BodyText"/>
+      </w:pPr>
+      <w:r>
+        <w:rPr>
+          <w:rFonts w:hint="eastAsia"/>
+          <w:b/>
+          <w:bCs/>
+        </w:rPr>
+        <w:t xml:space="preserve">points_history表</w:t>
+      </w:r>
+      <w:r>
+        <w:rPr>
+          <w:rFonts w:hint="eastAsia"/>
+        </w:rPr>
+        <w:t xml:space="preserve">：积分流水表，完整记录每次积分变动的来源类型（</w:t>
+      </w:r>
+      <w:r>
+        <w:rPr>
+          <w:rStyle w:val="VerbatimChar"/>
+        </w:rPr>
+        <w:t xml:space="preserve">related_type</w:t>
+      </w:r>
+      <w:r>
+        <w:rPr>
+          <w:rFonts w:hint="eastAsia"/>
+        </w:rPr>
+        <w:t xml:space="preserve">）、变动量（</w:t>
+      </w:r>
+      <w:r>
+        <w:rPr>
+          <w:rStyle w:val="VerbatimChar"/>
+        </w:rPr>
+        <w:t xml:space="preserve">points_change</w:t>
+      </w:r>
+      <w:r>
+        <w:rPr>
+          <w:rFonts w:hint="eastAsia"/>
+        </w:rPr>
+        <w:t xml:space="preserve">）及变动后余额（</w:t>
+      </w:r>
+      <w:r>
+        <w:rPr>
+          <w:rStyle w:val="VerbatimChar"/>
+        </w:rPr>
+        <w:t xml:space="preserve">points_after</w:t>
+      </w:r>
+      <w:r>
+        <w:rPr>
+          <w:rFonts w:hint="eastAsia"/>
+        </w:rPr>
+        <w:t xml:space="preserve">），为用户提供完整的积分明细查询。</w:t>
+      </w:r>
+    </w:p>
+    <w:p>
+      <w:pPr>
+        <w:pStyle w:val="BodyText"/>
+      </w:pPr>
+      <w:r>
+        <w:rPr>
+          <w:rFonts w:hint="eastAsia"/>
+          <w:b/>
+          <w:bCs/>
+        </w:rPr>
+        <w:t xml:space="preserve">system_config表</w:t>
+      </w:r>
+      <w:r>
+        <w:rPr>
+          <w:rFonts w:hint="eastAsia"/>
+        </w:rPr>
+        <w:t xml:space="preserve">：系统配置表，采用Key-Value结构存储29项可配置参数，包括积分规则、等级阈值、上传限制、功能开关等，支持在线修改无需重启。</w:t>
+      </w:r>
+    </w:p>
+    <w:p>
+      <w:pPr>
+        <w:pStyle w:val="CaptionedFigure"/>
+      </w:pPr>
+      <w:r>
+        <w:drawing>
+          <wp:inline>
+            <wp:extent cx="5334000" cy="3886200"/>
+            <wp:effectExtent b="0" l="0" r="0" t="0"/>
+            <wp:docPr descr="图4-2 数据库核心ER图" title="" id="33" name="Picture"/>
+            <a:graphic>
+              <a:graphicData uri="http://schemas.openxmlformats.org/drawingml/2006/picture">
+                <pic:pic>
+                  <pic:nvPicPr>
+                    <pic:cNvPr descr="thesis-figures/02_er_diagram.png" id="34" name="Picture"/>
+                    <pic:cNvPicPr>
+                      <a:picLocks noChangeArrowheads="1" noChangeAspect="1"/>
+                    </pic:cNvPicPr>
+                  </pic:nvPicPr>
+                  <pic:blipFill>
+                    <a:blip r:embed="rId32"/>
                     <a:stretch>
                       <a:fillRect/>
                     </a:stretch>
@@ -2293,7 +2382,7 @@
         <w:rPr>
           <w:rFonts w:hint="eastAsia"/>
         </w:rPr>
-        <w:t xml:space="preserve">图4-1</w:t>
+        <w:t xml:space="preserve">图4-2</w:t>
       </w:r>
       <w:r>
         <w:t xml:space="preserve"> </w:t>
@@ -2315,7 +2404,7 @@
           <w:b/>
           <w:bCs/>
         </w:rPr>
-        <w:t xml:space="preserve">图4-1</w:t>
+        <w:t xml:space="preserve">图4-2</w:t>
       </w:r>
       <w:r>
         <w:t xml:space="preserve"> </w:t>
@@ -2327,8 +2416,8 @@
         <w:t xml:space="preserve">数据库核心ER图</w:t>
       </w:r>
     </w:p>
-    <w:bookmarkEnd w:id="32"/>
-    <w:bookmarkStart w:id="33" w:name="api接口设计"/>
+    <w:bookmarkEnd w:id="35"/>
+    <w:bookmarkStart w:id="36" w:name="api接口设计"/>
     <w:p>
       <w:pPr>
         <w:pStyle w:val="Heading2"/>
@@ -2670,8 +2759,8 @@
         <w:t xml:space="preserve">后端代理获取，绕过浏览器跨域限制，实现在线预览。</w:t>
       </w:r>
     </w:p>
-    <w:bookmarkEnd w:id="33"/>
-    <w:bookmarkStart w:id="37" w:name="安全机制设计"/>
+    <w:bookmarkEnd w:id="36"/>
+    <w:bookmarkStart w:id="40" w:name="安全机制设计"/>
     <w:p>
       <w:pPr>
         <w:pStyle w:val="Heading2"/>
@@ -2776,18 +2865,18 @@
           <wp:inline>
             <wp:extent cx="5334000" cy="7230656"/>
             <wp:effectExtent b="0" l="0" r="0" t="0"/>
-            <wp:docPr descr="图4-2 JWT双令牌刷新流程图" title="" id="35" name="Picture"/>
+            <wp:docPr descr="图4-3 JWT双令牌刷新流程图" title="" id="38" name="Picture"/>
             <a:graphic>
               <a:graphicData uri="http://schemas.openxmlformats.org/drawingml/2006/picture">
                 <pic:pic>
                   <pic:nvPicPr>
-                    <pic:cNvPr descr="thesis-figures/04_token_refresh.png" id="36" name="Picture"/>
+                    <pic:cNvPr descr="thesis-figures/04_token_refresh.png" id="39" name="Picture"/>
                     <pic:cNvPicPr>
                       <a:picLocks noChangeArrowheads="1" noChangeAspect="1"/>
                     </pic:cNvPicPr>
                   </pic:nvPicPr>
                   <pic:blipFill>
-                    <a:blip r:embed="rId34"/>
+                    <a:blip r:embed="rId37"/>
                     <a:stretch>
                       <a:fillRect/>
                     </a:stretch>
@@ -2822,7 +2911,7 @@
         <w:rPr>
           <w:rFonts w:hint="eastAsia"/>
         </w:rPr>
-        <w:t xml:space="preserve">图4-2</w:t>
+        <w:t xml:space="preserve">图4-3</w:t>
       </w:r>
       <w:r>
         <w:t xml:space="preserve"> </w:t>
@@ -2844,7 +2933,7 @@
           <w:b/>
           <w:bCs/>
         </w:rPr>
-        <w:t xml:space="preserve">图4-2</w:t>
+        <w:t xml:space="preserve">图4-3</w:t>
       </w:r>
       <w:r>
         <w:t xml:space="preserve"> </w:t>
@@ -2856,8 +2945,8 @@
         <w:t xml:space="preserve">JWT双令牌刷新流程图</w:t>
       </w:r>
     </w:p>
-    <w:bookmarkEnd w:id="37"/>
-    <w:bookmarkStart w:id="38" w:name="前端架构设计"/>
+    <w:bookmarkEnd w:id="40"/>
+    <w:bookmarkStart w:id="41" w:name="前端架构设计"/>
     <w:p>
       <w:pPr>
         <w:pStyle w:val="Heading2"/>
@@ -3101,9 +3190,9 @@
         </w:pict>
       </w:r>
     </w:p>
-    <w:bookmarkEnd w:id="38"/>
-    <w:bookmarkEnd w:id="39"/>
-    <w:bookmarkStart w:id="61" w:name="系统实现"/>
+    <w:bookmarkEnd w:id="41"/>
+    <w:bookmarkEnd w:id="42"/>
+    <w:bookmarkStart w:id="64" w:name="系统实现"/>
     <w:p>
       <w:pPr>
         <w:pStyle w:val="Heading1"/>
@@ -3115,7 +3204,7 @@
         <w:t xml:space="preserve">系统实现</w:t>
       </w:r>
     </w:p>
-    <w:bookmarkStart w:id="46" w:name="用户认证模块实现"/>
+    <w:bookmarkStart w:id="49" w:name="用户认证模块实现"/>
     <w:p>
       <w:pPr>
         <w:pStyle w:val="Heading2"/>
@@ -3364,20 +3453,20 @@
       <w:r>
         <w:drawing>
           <wp:inline>
-            <wp:extent cx="5334000" cy="7448662"/>
+            <wp:extent cx="5334000" cy="5178640"/>
             <wp:effectExtent b="0" l="0" r="0" t="0"/>
-            <wp:docPr descr="图5-1 用户注册登录流程图" title="" id="41" name="Picture"/>
+            <wp:docPr descr="图5-1 用户注册登录流程图" title="" id="44" name="Picture"/>
             <a:graphic>
               <a:graphicData uri="http://schemas.openxmlformats.org/drawingml/2006/picture">
                 <pic:pic>
                   <pic:nvPicPr>
-                    <pic:cNvPr descr="thesis-figures/03_login_flow.png" id="42" name="Picture"/>
+                    <pic:cNvPr descr="thesis-figures/03_login_flow.png" id="45" name="Picture"/>
                     <pic:cNvPicPr>
                       <a:picLocks noChangeArrowheads="1" noChangeAspect="1"/>
                     </pic:cNvPicPr>
                   </pic:nvPicPr>
                   <pic:blipFill>
-                    <a:blip r:embed="rId40"/>
+                    <a:blip r:embed="rId43"/>
                     <a:stretch>
                       <a:fillRect/>
                     </a:stretch>
@@ -3385,7 +3474,7 @@
                   <pic:spPr bwMode="auto">
                     <a:xfrm>
                       <a:off x="0" y="0"/>
-                      <a:ext cx="5334000" cy="7448662"/>
+                      <a:ext cx="5334000" cy="5178640"/>
                     </a:xfrm>
                     <a:prstGeom prst="rect">
                       <a:avLst/>
@@ -3455,18 +3544,18 @@
           <wp:inline>
             <wp:extent cx="5334000" cy="4359362"/>
             <wp:effectExtent b="0" l="0" r="0" t="0"/>
-            <wp:docPr descr="图5-2 JWT Token并发刷新时序图" title="" id="44" name="Picture"/>
+            <wp:docPr descr="图5-2 JWT Token并发刷新时序图" title="" id="47" name="Picture"/>
             <a:graphic>
               <a:graphicData uri="http://schemas.openxmlformats.org/drawingml/2006/picture">
                 <pic:pic>
                   <pic:nvPicPr>
-                    <pic:cNvPr descr="thesis-figures/08_seq_token.png" id="45" name="Picture"/>
+                    <pic:cNvPr descr="thesis-figures/08_seq_token.png" id="48" name="Picture"/>
                     <pic:cNvPicPr>
                       <a:picLocks noChangeArrowheads="1" noChangeAspect="1"/>
                     </pic:cNvPicPr>
                   </pic:nvPicPr>
                   <pic:blipFill>
-                    <a:blip r:embed="rId43"/>
+                    <a:blip r:embed="rId46"/>
                     <a:stretch>
                       <a:fillRect/>
                     </a:stretch>
@@ -3557,8 +3646,8 @@
         <w:t xml:space="preserve">：响应拦截器对401状态码作区分处理——若用户当前处于已登录状态，说明是Token过期导致，弹出提示框引导重新登录；若用户为游客状态，说明访问了需登录的接口，静默reject，由调用方决定是否展示登录引导。</w:t>
       </w:r>
     </w:p>
-    <w:bookmarkEnd w:id="46"/>
-    <w:bookmarkStart w:id="53" w:name="资源共享模块实现"/>
+    <w:bookmarkEnd w:id="49"/>
+    <w:bookmarkStart w:id="56" w:name="资源共享模块实现"/>
     <w:p>
       <w:pPr>
         <w:pStyle w:val="Heading2"/>
@@ -3719,18 +3808,18 @@
           <wp:inline>
             <wp:extent cx="5334000" cy="4783595"/>
             <wp:effectExtent b="0" l="0" r="0" t="0"/>
-            <wp:docPr descr="图5-3 资源OSS直传时序图" title="" id="48" name="Picture"/>
+            <wp:docPr descr="图5-3 资源OSS直传时序图" title="" id="51" name="Picture"/>
             <a:graphic>
               <a:graphicData uri="http://schemas.openxmlformats.org/drawingml/2006/picture">
                 <pic:pic>
                   <pic:nvPicPr>
-                    <pic:cNvPr descr="thesis-figures/07_seq_oss.png" id="49" name="Picture"/>
+                    <pic:cNvPr descr="thesis-figures/07_seq_oss.png" id="52" name="Picture"/>
                     <pic:cNvPicPr>
                       <a:picLocks noChangeArrowheads="1" noChangeAspect="1"/>
                     </pic:cNvPicPr>
                   </pic:nvPicPr>
                   <pic:blipFill>
-                    <a:blip r:embed="rId47"/>
+                    <a:blip r:embed="rId50"/>
                     <a:stretch>
                       <a:fillRect/>
                     </a:stretch>
@@ -3808,18 +3897,18 @@
           <wp:inline>
             <wp:extent cx="5199888" cy="8631936"/>
             <wp:effectExtent b="0" l="0" r="0" t="0"/>
-            <wp:docPr descr="图5-4 资源上传审核流程图" title="" id="51" name="Picture"/>
+            <wp:docPr descr="图5-4 资源上传审核流程图" title="" id="54" name="Picture"/>
             <a:graphic>
               <a:graphicData uri="http://schemas.openxmlformats.org/drawingml/2006/picture">
                 <pic:pic>
                   <pic:nvPicPr>
-                    <pic:cNvPr descr="thesis-figures/05_resource_flow.png" id="52" name="Picture"/>
+                    <pic:cNvPr descr="thesis-figures/05_resource_flow.png" id="55" name="Picture"/>
                     <pic:cNvPicPr>
                       <a:picLocks noChangeArrowheads="1" noChangeAspect="1"/>
                     </pic:cNvPicPr>
                   </pic:nvPicPr>
                   <pic:blipFill>
-                    <a:blip r:embed="rId50"/>
+                    <a:blip r:embed="rId53"/>
                     <a:stretch>
                       <a:fillRect/>
                     </a:stretch>
@@ -3931,8 +4020,8 @@
         <w:t xml:space="preserve">表及下载次数自增，确保积分扣减与下载记录的一致性。</w:t>
       </w:r>
     </w:p>
-    <w:bookmarkEnd w:id="53"/>
-    <w:bookmarkStart w:id="54" w:name="问答社区模块实现"/>
+    <w:bookmarkEnd w:id="56"/>
+    <w:bookmarkStart w:id="57" w:name="问答社区模块实现"/>
     <w:p>
       <w:pPr>
         <w:pStyle w:val="Heading2"/>
@@ -4177,8 +4266,8 @@
         <w:t xml:space="preserve">事务中，确保原子性。</w:t>
       </w:r>
     </w:p>
-    <w:bookmarkEnd w:id="54"/>
-    <w:bookmarkStart w:id="58" w:name="任务大厅模块实现"/>
+    <w:bookmarkEnd w:id="57"/>
+    <w:bookmarkStart w:id="61" w:name="任务大厅模块实现"/>
     <w:p>
       <w:pPr>
         <w:pStyle w:val="Heading2"/>
@@ -4284,18 +4373,18 @@
           <wp:inline>
             <wp:extent cx="5334000" cy="3749909"/>
             <wp:effectExtent b="0" l="0" r="0" t="0"/>
-            <wp:docPr descr="图5-5 任务大厅状态机流转图" title="" id="56" name="Picture"/>
+            <wp:docPr descr="图5-5 任务大厅状态机流转图" title="" id="59" name="Picture"/>
             <a:graphic>
               <a:graphicData uri="http://schemas.openxmlformats.org/drawingml/2006/picture">
                 <pic:pic>
                   <pic:nvPicPr>
-                    <pic:cNvPr descr="thesis-figures/06_task_state.png" id="57" name="Picture"/>
+                    <pic:cNvPr descr="thesis-figures/06_task_state.png" id="60" name="Picture"/>
                     <pic:cNvPicPr>
                       <a:picLocks noChangeArrowheads="1" noChangeAspect="1"/>
                     </pic:cNvPicPr>
                   </pic:nvPicPr>
                   <pic:blipFill>
-                    <a:blip r:embed="rId55"/>
+                    <a:blip r:embed="rId58"/>
                     <a:stretch>
                       <a:fillRect/>
                     </a:stretch>
@@ -4419,8 +4508,8 @@
         <w:t xml:space="preserve">），作为其他用户选择接单者时的参考依据。</w:t>
       </w:r>
     </w:p>
-    <w:bookmarkEnd w:id="58"/>
-    <w:bookmarkStart w:id="59" w:name="积分系统与等级模块实现"/>
+    <w:bookmarkEnd w:id="61"/>
+    <w:bookmarkStart w:id="62" w:name="积分系统与等级模块实现"/>
     <w:p>
       <w:pPr>
         <w:pStyle w:val="Heading2"/>
@@ -4533,8 +4622,8 @@
         <w:t xml:space="preserve">表统计连续日期的签到记录）。</w:t>
       </w:r>
     </w:p>
-    <w:bookmarkEnd w:id="59"/>
-    <w:bookmarkStart w:id="60" w:name="管理后台模块实现"/>
+    <w:bookmarkEnd w:id="62"/>
+    <w:bookmarkStart w:id="63" w:name="管理后台模块实现"/>
     <w:p>
       <w:pPr>
         <w:pStyle w:val="Heading2"/>
@@ -4770,9 +4859,9 @@
         </w:pict>
       </w:r>
     </w:p>
-    <w:bookmarkEnd w:id="60"/>
-    <w:bookmarkEnd w:id="61"/>
-    <w:bookmarkStart w:id="65" w:name="系统测试"/>
+    <w:bookmarkEnd w:id="63"/>
+    <w:bookmarkEnd w:id="64"/>
+    <w:bookmarkStart w:id="68" w:name="系统测试"/>
     <w:p>
       <w:pPr>
         <w:pStyle w:val="Heading1"/>
@@ -4784,7 +4873,7 @@
         <w:t xml:space="preserve">系统测试</w:t>
       </w:r>
     </w:p>
-    <w:bookmarkStart w:id="62" w:name="测试环境"/>
+    <w:bookmarkStart w:id="65" w:name="测试环境"/>
     <w:p>
       <w:pPr>
         <w:pStyle w:val="Heading2"/>
@@ -4947,8 +5036,8 @@
         <w:t xml:space="preserve">：通过SQL脚本预置了包括5名管理员、50名普通用户、100条资源、200条问题、300条回答在内的测试数据集</w:t>
       </w:r>
     </w:p>
-    <w:bookmarkEnd w:id="62"/>
-    <w:bookmarkStart w:id="63" w:name="功能测试"/>
+    <w:bookmarkEnd w:id="65"/>
+    <w:bookmarkStart w:id="66" w:name="功能测试"/>
     <w:p>
       <w:pPr>
         <w:pStyle w:val="Heading2"/>
@@ -5492,8 +5581,8 @@
         <w:t xml:space="preserve">：对20道不同学科的测试问题（含数学、编程、英语、专业课）触发AI自动回答功能，AI回答的参考质量评分平均为3.8分（满分5分），在编程与数学类问题上表现优秀（平均4.3分），在主观性较强的人文类问题上表现一般（平均3.1分）。</w:t>
       </w:r>
     </w:p>
-    <w:bookmarkEnd w:id="63"/>
-    <w:bookmarkStart w:id="64" w:name="性能测试"/>
+    <w:bookmarkEnd w:id="66"/>
+    <w:bookmarkStart w:id="67" w:name="性能测试"/>
     <w:p>
       <w:pPr>
         <w:pStyle w:val="Heading2"/>
@@ -5910,9 +5999,9 @@
         </w:pict>
       </w:r>
     </w:p>
-    <w:bookmarkEnd w:id="64"/>
-    <w:bookmarkEnd w:id="65"/>
-    <w:bookmarkStart w:id="68" w:name="结论与展望"/>
+    <w:bookmarkEnd w:id="67"/>
+    <w:bookmarkEnd w:id="68"/>
+    <w:bookmarkStart w:id="71" w:name="结论与展望"/>
     <w:p>
       <w:pPr>
         <w:pStyle w:val="Heading1"/>
@@ -5924,7 +6013,7 @@
         <w:t xml:space="preserve">结论与展望</w:t>
       </w:r>
     </w:p>
-    <w:bookmarkStart w:id="66" w:name="研究总结"/>
+    <w:bookmarkStart w:id="69" w:name="研究总结"/>
     <w:p>
       <w:pPr>
         <w:pStyle w:val="Heading2"/>
@@ -5996,8 +6085,8 @@
         <w:t xml:space="preserve">在业务层面，平台通过积分体系将知识贡献行为纳入量化激励框架，形成了资源沉淀→质量筛选→积分奖励→社区活跃的正向循环生态；任务大厅状态机与信用评分体系为校园内的技能互助行为提供了结构化的协作规范；定时公告与实时通知推送使管理员与用户之间的信息传达更为及时高效。</w:t>
       </w:r>
     </w:p>
-    <w:bookmarkEnd w:id="66"/>
-    <w:bookmarkStart w:id="67" w:name="不足与展望"/>
+    <w:bookmarkEnd w:id="69"/>
+    <w:bookmarkStart w:id="70" w:name="不足与展望"/>
     <w:p>
       <w:pPr>
         <w:pStyle w:val="Heading2"/>
@@ -6154,9 +6243,9 @@
         </w:pict>
       </w:r>
     </w:p>
-    <w:bookmarkEnd w:id="67"/>
-    <w:bookmarkEnd w:id="68"/>
-    <w:bookmarkStart w:id="69" w:name="参考文献"/>
+    <w:bookmarkEnd w:id="70"/>
+    <w:bookmarkEnd w:id="71"/>
+    <w:bookmarkStart w:id="72" w:name="参考文献"/>
     <w:p>
       <w:pPr>
         <w:pStyle w:val="Heading1"/>
@@ -6538,8 +6627,8 @@
         </w:pict>
       </w:r>
     </w:p>
-    <w:bookmarkEnd w:id="69"/>
-    <w:bookmarkStart w:id="70" w:name="致-谢"/>
+    <w:bookmarkEnd w:id="72"/>
+    <w:bookmarkStart w:id="73" w:name="致-谢"/>
     <w:p>
       <w:pPr>
         <w:pStyle w:val="Heading1"/>
@@ -6635,7 +6724,7 @@
         <w:t xml:space="preserve">受限于作者水平，论文中难免存在不足与疏漏之处，恳请各位评委老师批评指正。</w:t>
       </w:r>
     </w:p>
-    <w:bookmarkEnd w:id="70"/>
+    <w:bookmarkEnd w:id="73"/>
     <w:sectPr>
       <w:footnotePr>
         <w:numRestart w:val="eachSect"/>

</xml_diff>

<commit_message>
[Claude Code] 需要你帮我 prompt #57
</commit_message>
<xml_diff>
--- a/thesis.docx
+++ b/thesis.docx
@@ -6344,46 +6344,64 @@
         <w:rPr>
           <w:rFonts w:hint="eastAsia"/>
         </w:rPr>
-        <w:t xml:space="preserve">苗泽群,</w:t>
-      </w:r>
-      <w:r>
-        <w:t xml:space="preserve"> </w:t>
-      </w:r>
-      <w:r>
-        <w:rPr>
-          <w:rFonts w:hint="eastAsia"/>
-        </w:rPr>
-        <w:t xml:space="preserve">张建勋.</w:t>
-      </w:r>
-      <w:r>
-        <w:t xml:space="preserve"> </w:t>
-      </w:r>
-      <w:r>
-        <w:rPr>
-          <w:rFonts w:hint="eastAsia"/>
-        </w:rPr>
-        <w:t xml:space="preserve">基于Spring</w:t>
-      </w:r>
-      <w:r>
-        <w:t xml:space="preserve"> </w:t>
-      </w:r>
-      <w:r>
-        <w:rPr>
-          <w:rFonts w:hint="eastAsia"/>
-        </w:rPr>
-        <w:t xml:space="preserve">Boot的高校学习资源管理系统设计与实现[J].</w:t>
-      </w:r>
-      <w:r>
-        <w:t xml:space="preserve"> </w:t>
-      </w:r>
-      <w:r>
-        <w:rPr>
-          <w:rFonts w:hint="eastAsia"/>
-        </w:rPr>
-        <w:t xml:space="preserve">计算机应用与软件,</w:t>
-      </w:r>
-      <w:r>
-        <w:t xml:space="preserve"> 2022, 39(8): 46-51.</w:t>
+        <w:t xml:space="preserve">刘超慧,</w:t>
+      </w:r>
+      <w:r>
+        <w:t xml:space="preserve"> </w:t>
+      </w:r>
+      <w:r>
+        <w:rPr>
+          <w:rFonts w:hint="eastAsia"/>
+        </w:rPr>
+        <w:t xml:space="preserve">杨雨涵,</w:t>
+      </w:r>
+      <w:r>
+        <w:t xml:space="preserve"> </w:t>
+      </w:r>
+      <w:r>
+        <w:rPr>
+          <w:rFonts w:hint="eastAsia"/>
+        </w:rPr>
+        <w:t xml:space="preserve">邢丹阳,</w:t>
+      </w:r>
+      <w:r>
+        <w:t xml:space="preserve"> </w:t>
+      </w:r>
+      <w:r>
+        <w:rPr>
+          <w:rFonts w:hint="eastAsia"/>
+        </w:rPr>
+        <w:t xml:space="preserve">解秋寒,</w:t>
+      </w:r>
+      <w:r>
+        <w:t xml:space="preserve"> </w:t>
+      </w:r>
+      <w:r>
+        <w:rPr>
+          <w:rFonts w:hint="eastAsia"/>
+        </w:rPr>
+        <w:t xml:space="preserve">李舶永.</w:t>
+      </w:r>
+      <w:r>
+        <w:t xml:space="preserve"> </w:t>
+      </w:r>
+      <w:r>
+        <w:rPr>
+          <w:rFonts w:hint="eastAsia"/>
+        </w:rPr>
+        <w:t xml:space="preserve">基于SpringBoot的教学资源平台设计与实现[J].</w:t>
+      </w:r>
+      <w:r>
+        <w:t xml:space="preserve"> </w:t>
+      </w:r>
+      <w:r>
+        <w:rPr>
+          <w:rFonts w:hint="eastAsia"/>
+        </w:rPr>
+        <w:t xml:space="preserve">科技风,</w:t>
+      </w:r>
+      <w:r>
+        <w:t xml:space="preserve"> 2021(11): 129-130.</w:t>
       </w:r>
     </w:p>
     <w:p>
@@ -6397,37 +6415,46 @@
         <w:rPr>
           <w:rFonts w:hint="eastAsia"/>
         </w:rPr>
-        <w:t xml:space="preserve">赵志刚,</w:t>
-      </w:r>
-      <w:r>
-        <w:t xml:space="preserve"> </w:t>
-      </w:r>
-      <w:r>
-        <w:rPr>
-          <w:rFonts w:hint="eastAsia"/>
-        </w:rPr>
-        <w:t xml:space="preserve">刘洋.</w:t>
-      </w:r>
-      <w:r>
-        <w:t xml:space="preserve"> </w:t>
-      </w:r>
-      <w:r>
-        <w:rPr>
-          <w:rFonts w:hint="eastAsia"/>
-        </w:rPr>
-        <w:t xml:space="preserve">基于微服务架构的高校教学资源共享平台研究[J].</w:t>
-      </w:r>
-      <w:r>
-        <w:t xml:space="preserve"> </w:t>
-      </w:r>
-      <w:r>
-        <w:rPr>
-          <w:rFonts w:hint="eastAsia"/>
-        </w:rPr>
-        <w:t xml:space="preserve">现代教育技术,</w:t>
-      </w:r>
-      <w:r>
-        <w:t xml:space="preserve"> 2023, 33(2): 89-96.</w:t>
+        <w:t xml:space="preserve">师明,</w:t>
+      </w:r>
+      <w:r>
+        <w:t xml:space="preserve"> </w:t>
+      </w:r>
+      <w:r>
+        <w:rPr>
+          <w:rFonts w:hint="eastAsia"/>
+        </w:rPr>
+        <w:t xml:space="preserve">曾丹.</w:t>
+      </w:r>
+      <w:r>
+        <w:t xml:space="preserve"> </w:t>
+      </w:r>
+      <w:r>
+        <w:rPr>
+          <w:rFonts w:hint="eastAsia"/>
+        </w:rPr>
+        <w:t xml:space="preserve">基于Vue.js和Spring</w:t>
+      </w:r>
+      <w:r>
+        <w:t xml:space="preserve"> </w:t>
+      </w:r>
+      <w:r>
+        <w:rPr>
+          <w:rFonts w:hint="eastAsia"/>
+        </w:rPr>
+        <w:t xml:space="preserve">Boot的校招日记系统[J].</w:t>
+      </w:r>
+      <w:r>
+        <w:t xml:space="preserve"> </w:t>
+      </w:r>
+      <w:r>
+        <w:rPr>
+          <w:rFonts w:hint="eastAsia"/>
+        </w:rPr>
+        <w:t xml:space="preserve">工业控制计算机,</w:t>
+      </w:r>
+      <w:r>
+        <w:t xml:space="preserve"> 2020, 33(1): 95-97.</w:t>
       </w:r>
     </w:p>
     <w:p>
@@ -6441,37 +6468,64 @@
         <w:rPr>
           <w:rFonts w:hint="eastAsia"/>
         </w:rPr>
-        <w:t xml:space="preserve">林一鸣,</w:t>
-      </w:r>
-      <w:r>
-        <w:t xml:space="preserve"> </w:t>
-      </w:r>
-      <w:r>
-        <w:rPr>
-          <w:rFonts w:hint="eastAsia"/>
-        </w:rPr>
-        <w:t xml:space="preserve">陈华.</w:t>
-      </w:r>
-      <w:r>
-        <w:t xml:space="preserve"> </w:t>
-      </w:r>
-      <w:r>
-        <w:rPr>
-          <w:rFonts w:hint="eastAsia"/>
-        </w:rPr>
-        <w:t xml:space="preserve">基于Vue.js的前端单页面应用开发实践[J].</w:t>
-      </w:r>
-      <w:r>
-        <w:t xml:space="preserve"> </w:t>
-      </w:r>
-      <w:r>
-        <w:rPr>
-          <w:rFonts w:hint="eastAsia"/>
-        </w:rPr>
-        <w:t xml:space="preserve">计算机与数字工程,</w:t>
-      </w:r>
-      <w:r>
-        <w:t xml:space="preserve"> 2021, 49(11): 2301-2306.</w:t>
+        <w:t xml:space="preserve">朱文忠,</w:t>
+      </w:r>
+      <w:r>
+        <w:t xml:space="preserve"> </w:t>
+      </w:r>
+      <w:r>
+        <w:rPr>
+          <w:rFonts w:hint="eastAsia"/>
+        </w:rPr>
+        <w:t xml:space="preserve">彭楠,</w:t>
+      </w:r>
+      <w:r>
+        <w:t xml:space="preserve"> </w:t>
+      </w:r>
+      <w:r>
+        <w:rPr>
+          <w:rFonts w:hint="eastAsia"/>
+        </w:rPr>
+        <w:t xml:space="preserve">曹丰,</w:t>
+      </w:r>
+      <w:r>
+        <w:t xml:space="preserve"> </w:t>
+      </w:r>
+      <w:r>
+        <w:rPr>
+          <w:rFonts w:hint="eastAsia"/>
+        </w:rPr>
+        <w:t xml:space="preserve">何钰湄,</w:t>
+      </w:r>
+      <w:r>
+        <w:t xml:space="preserve"> </w:t>
+      </w:r>
+      <w:r>
+        <w:rPr>
+          <w:rFonts w:hint="eastAsia"/>
+        </w:rPr>
+        <w:t xml:space="preserve">牟定雕.</w:t>
+      </w:r>
+      <w:r>
+        <w:t xml:space="preserve"> </w:t>
+      </w:r>
+      <w:r>
+        <w:rPr>
+          <w:rFonts w:hint="eastAsia"/>
+        </w:rPr>
+        <w:t xml:space="preserve">基于vue.js的学术科技活动线上交流的设计与实现[J].</w:t>
+      </w:r>
+      <w:r>
+        <w:t xml:space="preserve"> </w:t>
+      </w:r>
+      <w:r>
+        <w:rPr>
+          <w:rFonts w:hint="eastAsia"/>
+        </w:rPr>
+        <w:t xml:space="preserve">长江信息通信,</w:t>
+      </w:r>
+      <w:r>
+        <w:t xml:space="preserve"> 2021(4): 67-69.</w:t>
       </w:r>
     </w:p>
     <w:p>
@@ -6485,46 +6539,37 @@
         <w:rPr>
           <w:rFonts w:hint="eastAsia"/>
         </w:rPr>
-        <w:t xml:space="preserve">陈雷,</w:t>
-      </w:r>
-      <w:r>
-        <w:t xml:space="preserve"> </w:t>
-      </w:r>
-      <w:r>
-        <w:rPr>
-          <w:rFonts w:hint="eastAsia"/>
-        </w:rPr>
-        <w:t xml:space="preserve">孙巍.</w:t>
-      </w:r>
-      <w:r>
-        <w:t xml:space="preserve"> </w:t>
-      </w:r>
-      <w:r>
-        <w:rPr>
-          <w:rFonts w:hint="eastAsia"/>
-        </w:rPr>
-        <w:t xml:space="preserve">高校知识问答系统的设计与实现[D].</w:t>
-      </w:r>
-      <w:r>
-        <w:t xml:space="preserve"> </w:t>
-      </w:r>
-      <w:r>
-        <w:rPr>
-          <w:rFonts w:hint="eastAsia"/>
-        </w:rPr>
-        <w:t xml:space="preserve">北京:</w:t>
-      </w:r>
-      <w:r>
-        <w:t xml:space="preserve"> </w:t>
-      </w:r>
-      <w:r>
-        <w:rPr>
-          <w:rFonts w:hint="eastAsia"/>
-        </w:rPr>
-        <w:t xml:space="preserve">北京邮电大学,</w:t>
-      </w:r>
-      <w:r>
-        <w:t xml:space="preserve"> 2021.</w:t>
+        <w:t xml:space="preserve">赵明文,</w:t>
+      </w:r>
+      <w:r>
+        <w:t xml:space="preserve"> </w:t>
+      </w:r>
+      <w:r>
+        <w:rPr>
+          <w:rFonts w:hint="eastAsia"/>
+        </w:rPr>
+        <w:t xml:space="preserve">闾枫.</w:t>
+      </w:r>
+      <w:r>
+        <w:t xml:space="preserve"> </w:t>
+      </w:r>
+      <w:r>
+        <w:rPr>
+          <w:rFonts w:hint="eastAsia"/>
+        </w:rPr>
+        <w:t xml:space="preserve">基于SpringBoot的高校学习社区的设计与实现[J].</w:t>
+      </w:r>
+      <w:r>
+        <w:t xml:space="preserve"> </w:t>
+      </w:r>
+      <w:r>
+        <w:rPr>
+          <w:rFonts w:hint="eastAsia"/>
+        </w:rPr>
+        <w:t xml:space="preserve">电子测试,</w:t>
+      </w:r>
+      <w:r>
+        <w:t xml:space="preserve"> 2020(13): 35-36.</w:t>
       </w:r>
     </w:p>
     <w:p>

</xml_diff>